<commit_message>
fix(my-leads): depurado only after two No contesta on the company, not any two logs.
Co-authored-by: Cursor <cursoragent@cursor.com>
</commit_message>
<xml_diff>
--- a/docs/manual-cola-mis-clientes-supervisora.docx
+++ b/docs/manual-cola-mis-clientes-supervisora.docx
@@ -272,7 +272,7 @@
           <w:color w:val="1F2937"/>
           <w:sz w:val="24"/>
         </w:rPr>
-        <w:t>Respuestas y porcentajes</w:t>
+        <w:t>Modal al cambiar respuesta del mismo contacto</w:t>
       </w:r>
     </w:p>
     <w:p>
@@ -295,7 +295,7 @@
           <w:color w:val="1F2937"/>
           <w:sz w:val="24"/>
         </w:rPr>
-        <w:t>Dónde va cada respuesta</w:t>
+        <w:t>Respuestas y porcentajes</w:t>
       </w:r>
     </w:p>
     <w:p>
@@ -318,7 +318,7 @@
           <w:color w:val="1F2937"/>
           <w:sz w:val="24"/>
         </w:rPr>
-        <w:t>Lista, Detalle y Tarjetas</w:t>
+        <w:t>Dónde va cada respuesta</w:t>
       </w:r>
     </w:p>
     <w:p>
@@ -341,7 +341,7 @@
           <w:color w:val="1F2937"/>
           <w:sz w:val="24"/>
         </w:rPr>
-        <w:t>Tras guardar: Resultado guardado vs Actualizando cola</w:t>
+        <w:t>Lista, Detalle y Tarjetas</w:t>
       </w:r>
     </w:p>
     <w:p>
@@ -364,7 +364,7 @@
           <w:color w:val="1F2937"/>
           <w:sz w:val="24"/>
         </w:rPr>
-        <w:t>Qué no hacer</w:t>
+        <w:t>Tras guardar: Resultado guardado vs Actualizando cola</w:t>
       </w:r>
     </w:p>
     <w:p>
@@ -379,6 +379,29 @@
           <w:sz w:val="24"/>
         </w:rPr>
         <w:t xml:space="preserve">12.  </w:t>
+      </w:r>
+      <w:r>
+        <w:rPr>
+          <w:rFonts w:ascii="Calibri" w:hAnsi="Calibri" w:eastAsia="Calibri"/>
+          <w:b w:val="0"/>
+          <w:color w:val="1F2937"/>
+          <w:sz w:val="24"/>
+        </w:rPr>
+        <w:t>Qué no hacer</w:t>
+      </w:r>
+    </w:p>
+    <w:p>
+      <w:pPr>
+        <w:spacing w:after="80" w:before="0"/>
+      </w:pPr>
+      <w:r>
+        <w:rPr>
+          <w:rFonts w:ascii="Calibri" w:hAnsi="Calibri" w:eastAsia="Calibri"/>
+          <w:b/>
+          <w:color w:val="0F4C5C"/>
+          <w:sz w:val="24"/>
+        </w:rPr>
+        <w:t xml:space="preserve">13.  </w:t>
       </w:r>
       <w:r>
         <w:rPr>
@@ -2009,7 +2032,258 @@
           <w:color w:val="1E3A5F"/>
           <w:sz w:val="32"/>
         </w:rPr>
-        <w:t>7. Respuestas y porcentajes</w:t>
+        <w:t>7. Modal al cambiar respuesta del mismo contacto</w:t>
+      </w:r>
+    </w:p>
+    <w:p>
+      <w:pPr>
+        <w:spacing w:after="160" w:before="0" w:line="240" w:lineRule="auto"/>
+      </w:pPr>
+      <w:r>
+        <w:rPr>
+          <w:rFonts w:ascii="Calibri" w:hAnsi="Calibri" w:eastAsia="Calibri"/>
+          <w:b w:val="0"/>
+          <w:color w:val="1F2937"/>
+          <w:sz w:val="22"/>
+        </w:rPr>
+        <w:t xml:space="preserve">Si </w:t>
+      </w:r>
+      <w:r>
+        <w:rPr>
+          <w:rFonts w:ascii="Calibri" w:hAnsi="Calibri" w:eastAsia="Calibri"/>
+          <w:b/>
+          <w:color w:val="1F2937"/>
+          <w:sz w:val="22"/>
+        </w:rPr>
+        <w:t>este contacto</w:t>
+      </w:r>
+      <w:r>
+        <w:rPr>
+          <w:rFonts w:ascii="Calibri" w:hAnsi="Calibri" w:eastAsia="Calibri"/>
+          <w:b w:val="0"/>
+          <w:color w:val="1F2937"/>
+          <w:sz w:val="22"/>
+        </w:rPr>
+        <w:t xml:space="preserve"> ya tiene una respuesta suya y usted elige </w:t>
+      </w:r>
+      <w:r>
+        <w:rPr>
+          <w:rFonts w:ascii="Calibri" w:hAnsi="Calibri" w:eastAsia="Calibri"/>
+          <w:b/>
+          <w:color w:val="1F2937"/>
+          <w:sz w:val="22"/>
+        </w:rPr>
+        <w:t>otra respuesta</w:t>
+      </w:r>
+      <w:r>
+        <w:rPr>
+          <w:rFonts w:ascii="Calibri" w:hAnsi="Calibri" w:eastAsia="Calibri"/>
+          <w:b w:val="0"/>
+          <w:color w:val="1F2937"/>
+          <w:sz w:val="22"/>
+        </w:rPr>
+        <w:t xml:space="preserve"> distinta, aparece un aviso </w:t>
+      </w:r>
+      <w:r>
+        <w:rPr>
+          <w:rFonts w:ascii="Calibri" w:hAnsi="Calibri" w:eastAsia="Calibri"/>
+          <w:b/>
+          <w:color w:val="1F2937"/>
+          <w:sz w:val="22"/>
+        </w:rPr>
+        <w:t>antes</w:t>
+      </w:r>
+      <w:r>
+        <w:rPr>
+          <w:rFonts w:ascii="Calibri" w:hAnsi="Calibri" w:eastAsia="Calibri"/>
+          <w:b w:val="0"/>
+          <w:color w:val="1F2937"/>
+          <w:sz w:val="22"/>
+        </w:rPr>
+        <w:t xml:space="preserve"> de Guardando…. No es el modal de segundo contacto: es el mismo número, otra etiqueta.</w:t>
+      </w:r>
+    </w:p>
+    <w:p>
+      <w:pPr>
+        <w:pStyle w:val="ListBullet"/>
+        <w:spacing w:after="60"/>
+        <w:ind w:left="567"/>
+      </w:pPr>
+      <w:r>
+        <w:rPr>
+          <w:rFonts w:ascii="Calibri" w:hAnsi="Calibri" w:eastAsia="Calibri"/>
+          <w:b w:val="0"/>
+          <w:color w:val="1F2937"/>
+          <w:sz w:val="22"/>
+        </w:rPr>
+        <w:t xml:space="preserve">Título: </w:t>
+      </w:r>
+      <w:r>
+        <w:rPr>
+          <w:rFonts w:ascii="Calibri" w:hAnsi="Calibri" w:eastAsia="Calibri"/>
+          <w:b/>
+          <w:color w:val="1F2937"/>
+          <w:sz w:val="22"/>
+        </w:rPr>
+        <w:t>Este contacto ya tiene una respuesta</w:t>
+      </w:r>
+      <w:r>
+        <w:rPr>
+          <w:rFonts w:ascii="Calibri" w:hAnsi="Calibri" w:eastAsia="Calibri"/>
+          <w:b w:val="0"/>
+          <w:color w:val="1F2937"/>
+          <w:sz w:val="22"/>
+        </w:rPr>
+        <w:t>.</w:t>
+      </w:r>
+    </w:p>
+    <w:p>
+      <w:pPr>
+        <w:pStyle w:val="ListBullet"/>
+        <w:spacing w:after="60"/>
+        <w:ind w:left="567"/>
+      </w:pPr>
+      <w:r>
+        <w:rPr>
+          <w:rFonts w:ascii="Calibri" w:hAnsi="Calibri" w:eastAsia="Calibri"/>
+          <w:b w:val="0"/>
+          <w:color w:val="1F2937"/>
+          <w:sz w:val="22"/>
+        </w:rPr>
+        <w:t xml:space="preserve">Le dice qué registró antes y qué va a guardar ahora. La anterior </w:t>
+      </w:r>
+      <w:r>
+        <w:rPr>
+          <w:rFonts w:ascii="Calibri" w:hAnsi="Calibri" w:eastAsia="Calibri"/>
+          <w:b/>
+          <w:color w:val="1F2937"/>
+          <w:sz w:val="22"/>
+        </w:rPr>
+        <w:t>queda en el historial</w:t>
+      </w:r>
+      <w:r>
+        <w:rPr>
+          <w:rFonts w:ascii="Calibri" w:hAnsi="Calibri" w:eastAsia="Calibri"/>
+          <w:b w:val="0"/>
+          <w:color w:val="1F2937"/>
+          <w:sz w:val="22"/>
+        </w:rPr>
+        <w:t>; no se borra.</w:t>
+      </w:r>
+    </w:p>
+    <w:p>
+      <w:pPr>
+        <w:pStyle w:val="ListBullet"/>
+        <w:spacing w:after="60"/>
+        <w:ind w:left="567"/>
+      </w:pPr>
+      <w:r>
+        <w:rPr>
+          <w:rFonts w:ascii="Calibri" w:hAnsi="Calibri" w:eastAsia="Calibri"/>
+          <w:b w:val="0"/>
+          <w:color w:val="1F2937"/>
+          <w:sz w:val="22"/>
+        </w:rPr>
+        <w:t xml:space="preserve">Puede </w:t>
+      </w:r>
+      <w:r>
+        <w:rPr>
+          <w:rFonts w:ascii="Calibri" w:hAnsi="Calibri" w:eastAsia="Calibri"/>
+          <w:b/>
+          <w:color w:val="1F2937"/>
+          <w:sz w:val="22"/>
+        </w:rPr>
+        <w:t>Cancelar</w:t>
+      </w:r>
+      <w:r>
+        <w:rPr>
+          <w:rFonts w:ascii="Calibri" w:hAnsi="Calibri" w:eastAsia="Calibri"/>
+          <w:b w:val="0"/>
+          <w:color w:val="1F2937"/>
+          <w:sz w:val="22"/>
+        </w:rPr>
+        <w:t xml:space="preserve"> o pulsar </w:t>
+      </w:r>
+      <w:r>
+        <w:rPr>
+          <w:rFonts w:ascii="Calibri" w:hAnsi="Calibri" w:eastAsia="Calibri"/>
+          <w:b/>
+          <w:color w:val="1F2937"/>
+          <w:sz w:val="22"/>
+        </w:rPr>
+        <w:t>Sí, guardar nueva respuesta</w:t>
+      </w:r>
+      <w:r>
+        <w:rPr>
+          <w:rFonts w:ascii="Calibri" w:hAnsi="Calibri" w:eastAsia="Calibri"/>
+          <w:b w:val="0"/>
+          <w:color w:val="1F2937"/>
+          <w:sz w:val="22"/>
+        </w:rPr>
+        <w:t>.</w:t>
+      </w:r>
+    </w:p>
+    <w:p>
+      <w:pPr>
+        <w:pStyle w:val="ListBullet"/>
+        <w:spacing w:after="60"/>
+        <w:ind w:left="567"/>
+      </w:pPr>
+      <w:r>
+        <w:rPr>
+          <w:rFonts w:ascii="Calibri" w:hAnsi="Calibri" w:eastAsia="Calibri"/>
+          <w:b w:val="0"/>
+          <w:color w:val="1F2937"/>
+          <w:sz w:val="22"/>
+        </w:rPr>
+        <w:t xml:space="preserve">Opcional: </w:t>
+      </w:r>
+      <w:r>
+        <w:rPr>
+          <w:rFonts w:ascii="Calibri" w:hAnsi="Calibri" w:eastAsia="Calibri"/>
+          <w:b/>
+          <w:color w:val="1F2937"/>
+          <w:sz w:val="22"/>
+        </w:rPr>
+        <w:t>No volver a preguntar en este contacto</w:t>
+      </w:r>
+      <w:r>
+        <w:rPr>
+          <w:rFonts w:ascii="Calibri" w:hAnsi="Calibri" w:eastAsia="Calibri"/>
+          <w:b w:val="0"/>
+          <w:color w:val="1F2937"/>
+          <w:sz w:val="22"/>
+        </w:rPr>
+        <w:t xml:space="preserve"> (solo esta sesión, por ese contacto).</w:t>
+      </w:r>
+    </w:p>
+    <w:p>
+      <w:pPr>
+        <w:spacing w:after="160" w:before="0" w:line="240" w:lineRule="auto"/>
+      </w:pPr>
+      <w:r>
+        <w:rPr>
+          <w:rFonts w:ascii="Calibri" w:hAnsi="Calibri" w:eastAsia="Calibri"/>
+          <w:b w:val="0"/>
+          <w:color w:val="1F2937"/>
+          <w:sz w:val="22"/>
+        </w:rPr>
+        <w:t>No aparece en el primer guardado, ni si solo cambia notas, ni si solo mueve la agenda, ni si la respuesta es la misma.</w:t>
+      </w:r>
+    </w:p>
+    <w:p>
+      <w:pPr>
+        <w:pStyle w:val="Heading1"/>
+        <w:spacing w:before="320" w:after="120"/>
+      </w:pPr>
+      <w:r>
+        <w:rPr>
+          <w:rFonts w:ascii="Calibri" w:hAnsi="Calibri" w:eastAsia="Calibri"/>
+          <w:b/>
+          <w:color w:val="1E3A5F"/>
+          <w:sz w:val="32"/>
+        </w:rPr>
+        <w:t>8. Respuestas y porcentajes</w:t>
       </w:r>
     </w:p>
     <w:p>
@@ -2465,7 +2739,7 @@
           <w:color w:val="1E3A5F"/>
           <w:sz w:val="32"/>
         </w:rPr>
-        <w:t>8. Dónde va cada respuesta</w:t>
+        <w:t>9. Dónde va cada respuesta</w:t>
       </w:r>
     </w:p>
     <w:p>
@@ -2923,7 +3197,7 @@
                 <w:color w:val="1F2937"/>
                 <w:sz w:val="20"/>
               </w:rPr>
-              <w:t>No contesta (1 intento)</w:t>
+              <w:t>No contesta (1 en la empresa)</w:t>
             </w:r>
           </w:p>
         </w:tc>
@@ -3004,7 +3278,7 @@
                 <w:color w:val="1F2937"/>
                 <w:sz w:val="20"/>
               </w:rPr>
-              <w:t>Puede volver a marcar. Un intento no saca la ficha.</w:t>
+              <w:t>Cuenta solo No contesta, no cualquier llamada. Un No contesta no saca la ficha.</w:t>
             </w:r>
           </w:p>
         </w:tc>
@@ -3037,7 +3311,7 @@
                 <w:color w:val="1F2937"/>
                 <w:sz w:val="20"/>
               </w:rPr>
-              <w:t>No contesta (2 o más)</w:t>
+              <w:t>No contesta (2 o más en la empresa)</w:t>
             </w:r>
           </w:p>
         </w:tc>
@@ -3121,7 +3395,7 @@
                 <w:color w:val="1F2937"/>
                 <w:sz w:val="20"/>
               </w:rPr>
-              <w:t>Sale de Detalle. Nunca va a Otros. No la busque en la cola 1/N.</w:t>
+              <w:t>Dos No contesta del agente en esa empresa. Sale de Detalle. Nunca va a Otros.</w:t>
             </w:r>
           </w:p>
         </w:tc>
@@ -3851,7 +4125,7 @@
           <w:color w:val="1F2937"/>
           <w:sz w:val="22"/>
         </w:rPr>
-        <w:t>No contesta</w:t>
+        <w:t>Dos No contesta</w:t>
       </w:r>
       <w:r>
         <w:rPr>
@@ -3860,7 +4134,7 @@
           <w:color w:val="1F2937"/>
           <w:sz w:val="22"/>
         </w:rPr>
-        <w:t xml:space="preserve"> dos veces va a </w:t>
+        <w:t xml:space="preserve"> en la </w:t>
       </w:r>
       <w:r>
         <w:rPr>
@@ -3869,7 +4143,7 @@
           <w:color w:val="1F2937"/>
           <w:sz w:val="22"/>
         </w:rPr>
-        <w:t>depurado</w:t>
+        <w:t>empresa</w:t>
       </w:r>
       <w:r>
         <w:rPr>
@@ -3878,7 +4152,129 @@
           <w:color w:val="1F2937"/>
           <w:sz w:val="22"/>
         </w:rPr>
+        <w:t xml:space="preserve"> (no dos llamadas cualesquiera) van a </w:t>
+      </w:r>
+      <w:r>
+        <w:rPr>
+          <w:rFonts w:ascii="Calibri" w:hAnsi="Calibri" w:eastAsia="Calibri"/>
+          <w:b/>
+          <w:color w:val="1F2937"/>
+          <w:sz w:val="22"/>
+        </w:rPr>
+        <w:t>depurado</w:t>
+      </w:r>
+      <w:r>
+        <w:rPr>
+          <w:rFonts w:ascii="Calibri" w:hAnsi="Calibri" w:eastAsia="Calibri"/>
+          <w:b w:val="0"/>
+          <w:color w:val="1F2937"/>
+          <w:sz w:val="22"/>
+        </w:rPr>
         <w:t>, no a Otros.</w:t>
+      </w:r>
+    </w:p>
+    <w:p>
+      <w:pPr>
+        <w:spacing w:after="160" w:before="0" w:line="240" w:lineRule="auto"/>
+      </w:pPr>
+      <w:r>
+        <w:rPr>
+          <w:rFonts w:ascii="Calibri" w:hAnsi="Calibri" w:eastAsia="Calibri"/>
+          <w:b w:val="0"/>
+          <w:color w:val="1F2937"/>
+          <w:sz w:val="22"/>
+        </w:rPr>
+        <w:t xml:space="preserve">Ejemplo: </w:t>
+      </w:r>
+      <w:r>
+        <w:rPr>
+          <w:rFonts w:ascii="Calibri" w:hAnsi="Calibri" w:eastAsia="Calibri"/>
+          <w:b/>
+          <w:color w:val="1F2937"/>
+          <w:sz w:val="22"/>
+        </w:rPr>
+        <w:t>Sin llegada</w:t>
+      </w:r>
+      <w:r>
+        <w:rPr>
+          <w:rFonts w:ascii="Calibri" w:hAnsi="Calibri" w:eastAsia="Calibri"/>
+          <w:b w:val="0"/>
+          <w:color w:val="1F2937"/>
+          <w:sz w:val="22"/>
+        </w:rPr>
+        <w:t xml:space="preserve"> y después </w:t>
+      </w:r>
+      <w:r>
+        <w:rPr>
+          <w:rFonts w:ascii="Calibri" w:hAnsi="Calibri" w:eastAsia="Calibri"/>
+          <w:b/>
+          <w:color w:val="1F2937"/>
+          <w:sz w:val="22"/>
+        </w:rPr>
+        <w:t>No contesta</w:t>
+      </w:r>
+      <w:r>
+        <w:rPr>
+          <w:rFonts w:ascii="Calibri" w:hAnsi="Calibri" w:eastAsia="Calibri"/>
+          <w:b w:val="0"/>
+          <w:color w:val="1F2937"/>
+          <w:sz w:val="22"/>
+        </w:rPr>
+        <w:t xml:space="preserve"> (Guardar actualización crea una fila nueva) = </w:t>
+      </w:r>
+      <w:r>
+        <w:rPr>
+          <w:rFonts w:ascii="Calibri" w:hAnsi="Calibri" w:eastAsia="Calibri"/>
+          <w:b/>
+          <w:color w:val="1F2937"/>
+          <w:sz w:val="22"/>
+        </w:rPr>
+        <w:t>un</w:t>
+      </w:r>
+      <w:r>
+        <w:rPr>
+          <w:rFonts w:ascii="Calibri" w:hAnsi="Calibri" w:eastAsia="Calibri"/>
+          <w:b w:val="0"/>
+          <w:color w:val="1F2937"/>
+          <w:sz w:val="22"/>
+        </w:rPr>
+        <w:t xml:space="preserve"> No contesta. Sigue en </w:t>
+      </w:r>
+      <w:r>
+        <w:rPr>
+          <w:rFonts w:ascii="Calibri" w:hAnsi="Calibri" w:eastAsia="Calibri"/>
+          <w:b/>
+          <w:color w:val="1F2937"/>
+          <w:sz w:val="22"/>
+        </w:rPr>
+        <w:t>Detalle</w:t>
+      </w:r>
+      <w:r>
+        <w:rPr>
+          <w:rFonts w:ascii="Calibri" w:hAnsi="Calibri" w:eastAsia="Calibri"/>
+          <w:b w:val="0"/>
+          <w:color w:val="1F2937"/>
+          <w:sz w:val="22"/>
+        </w:rPr>
+        <w:t xml:space="preserve"> y en la cola </w:t>
+      </w:r>
+      <w:r>
+        <w:rPr>
+          <w:rFonts w:ascii="Calibri" w:hAnsi="Calibri" w:eastAsia="Calibri"/>
+          <w:b/>
+          <w:color w:val="1F2937"/>
+          <w:sz w:val="22"/>
+        </w:rPr>
+        <w:t>No contesta</w:t>
+      </w:r>
+      <w:r>
+        <w:rPr>
+          <w:rFonts w:ascii="Calibri" w:hAnsi="Calibri" w:eastAsia="Calibri"/>
+          <w:b w:val="0"/>
+          <w:color w:val="1F2937"/>
+          <w:sz w:val="22"/>
+        </w:rPr>
+        <w:t>. No entra a depurado.</w:t>
       </w:r>
     </w:p>
     <w:p>
@@ -3893,7 +4289,7 @@
           <w:color w:val="1E3A5F"/>
           <w:sz w:val="32"/>
         </w:rPr>
-        <w:t>9. Lista, Detalle y Tarjetas</w:t>
+        <w:t>10. Lista, Detalle y Tarjetas</w:t>
       </w:r>
     </w:p>
     <w:p>
@@ -4258,7 +4654,7 @@
           <w:color w:val="1E3A5F"/>
           <w:sz w:val="32"/>
         </w:rPr>
-        <w:t>10. Tras guardar: Resultado guardado vs Actualizando cola</w:t>
+        <w:t>11. Tras guardar: Resultado guardado vs Actualizando cola</w:t>
       </w:r>
     </w:p>
     <w:p>
@@ -4308,7 +4704,25 @@
           <w:color w:val="1F2937"/>
           <w:sz w:val="22"/>
         </w:rPr>
-        <w:t xml:space="preserve"> (o el aviso de No contesta — depurado si era el segundo intento). El botón se libera: usted </w:t>
+        <w:t xml:space="preserve"> (o el aviso de No contesta — depurado si era el segundo </w:t>
+      </w:r>
+      <w:r>
+        <w:rPr>
+          <w:rFonts w:ascii="Calibri" w:hAnsi="Calibri" w:eastAsia="Calibri"/>
+          <w:b/>
+          <w:color w:val="1F2937"/>
+          <w:sz w:val="22"/>
+        </w:rPr>
+        <w:t>No contesta</w:t>
+      </w:r>
+      <w:r>
+        <w:rPr>
+          <w:rFonts w:ascii="Calibri" w:hAnsi="Calibri" w:eastAsia="Calibri"/>
+          <w:b w:val="0"/>
+          <w:color w:val="1F2937"/>
+          <w:sz w:val="22"/>
+        </w:rPr>
+        <w:t xml:space="preserve"> de esa empresa). El botón se libera: usted </w:t>
       </w:r>
       <w:r>
         <w:rPr>
@@ -4373,7 +4787,7 @@
           <w:color w:val="1E3A5F"/>
           <w:sz w:val="32"/>
         </w:rPr>
-        <w:t>11. Qué no hacer</w:t>
+        <w:t>12. Qué no hacer</w:t>
       </w:r>
     </w:p>
     <w:p>
@@ -4532,7 +4946,7 @@
           <w:color w:val="1F2937"/>
           <w:sz w:val="22"/>
         </w:rPr>
-        <w:t>No busque No contesta (2 veces) en Otros.</w:t>
+        <w:t>No busque No contesta (2 veces en la empresa) en Otros.</w:t>
       </w:r>
       <w:r>
         <w:rPr>
@@ -4599,7 +5013,7 @@
           <w:color w:val="1E3A5F"/>
           <w:sz w:val="32"/>
         </w:rPr>
-        <w:t>12. Preguntas frecuentes</w:t>
+        <w:t>13. Preguntas frecuentes</w:t>
       </w:r>
     </w:p>
     <w:p>
@@ -4812,7 +5226,7 @@
           <w:color w:val="1F2937"/>
           <w:sz w:val="22"/>
         </w:rPr>
-        <w:t xml:space="preserve">Un intento: sigue en </w:t>
+        <w:t xml:space="preserve">Depurado cuenta </w:t>
       </w:r>
       <w:r>
         <w:rPr>
@@ -4821,7 +5235,7 @@
           <w:color w:val="1F2937"/>
           <w:sz w:val="22"/>
         </w:rPr>
-        <w:t>Detalle</w:t>
+        <w:t>solo No contesta</w:t>
       </w:r>
       <w:r>
         <w:rPr>
@@ -4830,7 +5244,7 @@
           <w:color w:val="1F2937"/>
           <w:sz w:val="22"/>
         </w:rPr>
-        <w:t xml:space="preserve"> y en la cola </w:t>
+        <w:t xml:space="preserve"> de esa </w:t>
       </w:r>
       <w:r>
         <w:rPr>
@@ -4839,7 +5253,7 @@
           <w:color w:val="1F2937"/>
           <w:sz w:val="22"/>
         </w:rPr>
-        <w:t>No contesta</w:t>
+        <w:t>empresa</w:t>
       </w:r>
       <w:r>
         <w:rPr>
@@ -4848,7 +5262,43 @@
           <w:color w:val="1F2937"/>
           <w:sz w:val="22"/>
         </w:rPr>
-        <w:t xml:space="preserve">. Dos o más intentos: sale de Detalle y va a </w:t>
+        <w:t xml:space="preserve"> (sus registros, no dos llamadas cualesquiera). Un No contesta: sigue en </w:t>
+      </w:r>
+      <w:r>
+        <w:rPr>
+          <w:rFonts w:ascii="Calibri" w:hAnsi="Calibri" w:eastAsia="Calibri"/>
+          <w:b/>
+          <w:color w:val="1F2937"/>
+          <w:sz w:val="22"/>
+        </w:rPr>
+        <w:t>Detalle</w:t>
+      </w:r>
+      <w:r>
+        <w:rPr>
+          <w:rFonts w:ascii="Calibri" w:hAnsi="Calibri" w:eastAsia="Calibri"/>
+          <w:b w:val="0"/>
+          <w:color w:val="1F2937"/>
+          <w:sz w:val="22"/>
+        </w:rPr>
+        <w:t xml:space="preserve"> y en la cola </w:t>
+      </w:r>
+      <w:r>
+        <w:rPr>
+          <w:rFonts w:ascii="Calibri" w:hAnsi="Calibri" w:eastAsia="Calibri"/>
+          <w:b/>
+          <w:color w:val="1F2937"/>
+          <w:sz w:val="22"/>
+        </w:rPr>
+        <w:t>No contesta</w:t>
+      </w:r>
+      <w:r>
+        <w:rPr>
+          <w:rFonts w:ascii="Calibri" w:hAnsi="Calibri" w:eastAsia="Calibri"/>
+          <w:b w:val="0"/>
+          <w:color w:val="1F2937"/>
+          <w:sz w:val="22"/>
+        </w:rPr>
+        <w:t xml:space="preserve">. Dos o más No contesta: sale de Detalle y va a </w:t>
       </w:r>
       <w:r>
         <w:rPr>
@@ -4881,7 +5331,7 @@
           <w:color w:val="0F4C5C"/>
           <w:sz w:val="26"/>
         </w:rPr>
-        <w:t>¿Puedo llamar de nuevo a un No interesado?</w:t>
+        <w:t>Guardé Sin llegada y luego No contesta. ¿Se fue a depurado?</w:t>
       </w:r>
     </w:p>
     <w:p>
@@ -4895,7 +5345,7 @@
           <w:color w:val="1F2937"/>
           <w:sz w:val="22"/>
         </w:rPr>
-        <w:t xml:space="preserve">La ficha ya no está en la cola de trabajo. Supervisión puede abrirla desde </w:t>
+        <w:t xml:space="preserve">No. Eso es </w:t>
       </w:r>
       <w:r>
         <w:rPr>
@@ -4904,7 +5354,7 @@
           <w:color w:val="1F2937"/>
           <w:sz w:val="22"/>
         </w:rPr>
-        <w:t>Lista → Otros</w:t>
+        <w:t>un</w:t>
       </w:r>
       <w:r>
         <w:rPr>
@@ -4913,7 +5363,43 @@
           <w:color w:val="1F2937"/>
           <w:sz w:val="22"/>
         </w:rPr>
-        <w:t>. El agente no debe “buscarla” avanzando 1/N: no está ahí.</w:t>
+        <w:t xml:space="preserve"> No contesta. Aunque Guardar actualización cree una fila nueva, la anterior no era No contesta. La ficha sigue en </w:t>
+      </w:r>
+      <w:r>
+        <w:rPr>
+          <w:rFonts w:ascii="Calibri" w:hAnsi="Calibri" w:eastAsia="Calibri"/>
+          <w:b/>
+          <w:color w:val="1F2937"/>
+          <w:sz w:val="22"/>
+        </w:rPr>
+        <w:t>Detalle</w:t>
+      </w:r>
+      <w:r>
+        <w:rPr>
+          <w:rFonts w:ascii="Calibri" w:hAnsi="Calibri" w:eastAsia="Calibri"/>
+          <w:b w:val="0"/>
+          <w:color w:val="1F2937"/>
+          <w:sz w:val="22"/>
+        </w:rPr>
+        <w:t xml:space="preserve"> hasta que haya </w:t>
+      </w:r>
+      <w:r>
+        <w:rPr>
+          <w:rFonts w:ascii="Calibri" w:hAnsi="Calibri" w:eastAsia="Calibri"/>
+          <w:b/>
+          <w:color w:val="1F2937"/>
+          <w:sz w:val="22"/>
+        </w:rPr>
+        <w:t>dos No contesta</w:t>
+      </w:r>
+      <w:r>
+        <w:rPr>
+          <w:rFonts w:ascii="Calibri" w:hAnsi="Calibri" w:eastAsia="Calibri"/>
+          <w:b w:val="0"/>
+          <w:color w:val="1F2937"/>
+          <w:sz w:val="22"/>
+        </w:rPr>
+        <w:t xml:space="preserve"> en la empresa.</w:t>
       </w:r>
     </w:p>
     <w:p>
@@ -4928,7 +5414,7 @@
           <w:color w:val="0F4C5C"/>
           <w:sz w:val="26"/>
         </w:rPr>
-        <w:t>¿El porcentaje lo elijo yo?</w:t>
+        <w:t>Cambié la respuesta del mismo contacto y salió un aviso. ¿Borré la anterior?</w:t>
       </w:r>
     </w:p>
     <w:p>
@@ -4942,7 +5428,7 @@
           <w:color w:val="1F2937"/>
           <w:sz w:val="22"/>
         </w:rPr>
-        <w:t xml:space="preserve">No. Usted elige la </w:t>
+        <w:t xml:space="preserve">No. La respuesta anterior queda en el historial. El aviso solo confirma que va a guardar una </w:t>
       </w:r>
       <w:r>
         <w:rPr>
@@ -4951,7 +5437,7 @@
           <w:color w:val="1F2937"/>
           <w:sz w:val="22"/>
         </w:rPr>
-        <w:t>Respuesta</w:t>
+        <w:t>nueva</w:t>
       </w:r>
       <w:r>
         <w:rPr>
@@ -4960,7 +5446,7 @@
           <w:color w:val="1F2937"/>
           <w:sz w:val="22"/>
         </w:rPr>
-        <w:t>. El porcentaje lo pone el sistema (0% operativas, 25% a 100% el embudo).</w:t>
+        <w:t>. Si solo cambió notas o la agenda, ese aviso no aparece.</w:t>
       </w:r>
     </w:p>
     <w:p>
@@ -4975,7 +5461,7 @@
           <w:color w:val="0F4C5C"/>
           <w:sz w:val="26"/>
         </w:rPr>
-        <w:t>¿Qué hago si hay dos contactos y ya llamé a uno?</w:t>
+        <w:t>¿Puedo llamar de nuevo a un No interesado?</w:t>
       </w:r>
     </w:p>
     <w:p>
@@ -4989,7 +5475,25 @@
           <w:color w:val="1F2937"/>
           <w:sz w:val="22"/>
         </w:rPr>
-        <w:t>Cambie de pestaña a mano. Si guarda en el segundo, el aviso de segundo contacto le pedirá confirmar. Es correcto registrar más de un número de la misma empresa.</w:t>
+        <w:t xml:space="preserve">La ficha ya no está en la cola de trabajo. Supervisión puede abrirla desde </w:t>
+      </w:r>
+      <w:r>
+        <w:rPr>
+          <w:rFonts w:ascii="Calibri" w:hAnsi="Calibri" w:eastAsia="Calibri"/>
+          <w:b/>
+          <w:color w:val="1F2937"/>
+          <w:sz w:val="22"/>
+        </w:rPr>
+        <w:t>Lista → Otros</w:t>
+      </w:r>
+      <w:r>
+        <w:rPr>
+          <w:rFonts w:ascii="Calibri" w:hAnsi="Calibri" w:eastAsia="Calibri"/>
+          <w:b w:val="0"/>
+          <w:color w:val="1F2937"/>
+          <w:sz w:val="22"/>
+        </w:rPr>
+        <w:t>. El agente no debe “buscarla” avanzando 1/N: no está ahí.</w:t>
       </w:r>
     </w:p>
     <w:p>
@@ -5004,7 +5508,7 @@
           <w:color w:val="0F4C5C"/>
           <w:sz w:val="26"/>
         </w:rPr>
-        <w:t>Cierre para quien capacita</w:t>
+        <w:t>¿El porcentaje lo elijo yo?</w:t>
       </w:r>
     </w:p>
     <w:p>
@@ -5018,7 +5522,83 @@
           <w:color w:val="1F2937"/>
           <w:sz w:val="22"/>
         </w:rPr>
-        <w:t>Pida al agente que, con el sistema abierto, marque una empresa pendiente, una Sin llegada, un No interesado (Otros) y un No contesta de dos intentos (depurado). Si distingue esas cuatro rutas, ya entiende la cola.</w:t>
+        <w:t xml:space="preserve">No. Usted elige la </w:t>
+      </w:r>
+      <w:r>
+        <w:rPr>
+          <w:rFonts w:ascii="Calibri" w:hAnsi="Calibri" w:eastAsia="Calibri"/>
+          <w:b/>
+          <w:color w:val="1F2937"/>
+          <w:sz w:val="22"/>
+        </w:rPr>
+        <w:t>Respuesta</w:t>
+      </w:r>
+      <w:r>
+        <w:rPr>
+          <w:rFonts w:ascii="Calibri" w:hAnsi="Calibri" w:eastAsia="Calibri"/>
+          <w:b w:val="0"/>
+          <w:color w:val="1F2937"/>
+          <w:sz w:val="22"/>
+        </w:rPr>
+        <w:t>. El porcentaje lo pone el sistema (0% operativas, 25% a 100% el embudo).</w:t>
+      </w:r>
+    </w:p>
+    <w:p>
+      <w:pPr>
+        <w:pStyle w:val="Heading2"/>
+        <w:spacing w:before="200" w:after="120"/>
+      </w:pPr>
+      <w:r>
+        <w:rPr>
+          <w:rFonts w:ascii="Calibri" w:hAnsi="Calibri" w:eastAsia="Calibri"/>
+          <w:b/>
+          <w:color w:val="0F4C5C"/>
+          <w:sz w:val="26"/>
+        </w:rPr>
+        <w:t>¿Qué hago si hay dos contactos y ya llamé a uno?</w:t>
+      </w:r>
+    </w:p>
+    <w:p>
+      <w:pPr>
+        <w:spacing w:after="160" w:before="0" w:line="240" w:lineRule="auto"/>
+      </w:pPr>
+      <w:r>
+        <w:rPr>
+          <w:rFonts w:ascii="Calibri" w:hAnsi="Calibri" w:eastAsia="Calibri"/>
+          <w:b w:val="0"/>
+          <w:color w:val="1F2937"/>
+          <w:sz w:val="22"/>
+        </w:rPr>
+        <w:t>Cambie de pestaña a mano. Si guarda en el segundo, el aviso de segundo contacto le pedirá confirmar. Es correcto registrar más de un número de la misma empresa.</w:t>
+      </w:r>
+    </w:p>
+    <w:p>
+      <w:pPr>
+        <w:pStyle w:val="Heading2"/>
+        <w:spacing w:before="200" w:after="120"/>
+      </w:pPr>
+      <w:r>
+        <w:rPr>
+          <w:rFonts w:ascii="Calibri" w:hAnsi="Calibri" w:eastAsia="Calibri"/>
+          <w:b/>
+          <w:color w:val="0F4C5C"/>
+          <w:sz w:val="26"/>
+        </w:rPr>
+        <w:t>Cierre para quien capacita</w:t>
+      </w:r>
+    </w:p>
+    <w:p>
+      <w:pPr>
+        <w:spacing w:after="160" w:before="0" w:line="240" w:lineRule="auto"/>
+      </w:pPr>
+      <w:r>
+        <w:rPr>
+          <w:rFonts w:ascii="Calibri" w:hAnsi="Calibri" w:eastAsia="Calibri"/>
+          <w:b w:val="0"/>
+          <w:color w:val="1F2937"/>
+          <w:sz w:val="22"/>
+        </w:rPr>
+        <w:t>Pida al agente que, con el sistema abierto, marque una empresa pendiente, una Sin llegada, un No interesado (Otros) y un No contesta de dos No contesta en la empresa (depurado). Si distingue esas cuatro rutas, ya entiende la cola.</w:t>
       </w:r>
     </w:p>
     <w:p>

</xml_diff>

<commit_message>
fix(my-leads): keep Guardar on the same contact tab and prefill each tab's last respuesta.
Co-authored-by: Cursor <cursoragent@cursor.com>
</commit_message>
<xml_diff>
--- a/docs/manual-cola-mis-clientes-supervisora.docx
+++ b/docs/manual-cola-mis-clientes-supervisora.docx
@@ -1385,7 +1385,61 @@
           <w:color w:val="1F2937"/>
           <w:sz w:val="22"/>
         </w:rPr>
-        <w:t xml:space="preserve">Si la empresa tiene tres contactos, usted decide a cuál llama. Guardar en un contacto no cambia automáticamente al siguiente contacto: cambia de </w:t>
+        <w:t xml:space="preserve">Si la empresa tiene tres contactos, usted decide a cuál llama. </w:t>
+      </w:r>
+      <w:r>
+        <w:rPr>
+          <w:rFonts w:ascii="Calibri" w:hAnsi="Calibri" w:eastAsia="Calibri"/>
+          <w:b/>
+          <w:color w:val="1F2937"/>
+          <w:sz w:val="22"/>
+        </w:rPr>
+        <w:t>Guardar resultado</w:t>
+      </w:r>
+      <w:r>
+        <w:rPr>
+          <w:rFonts w:ascii="Calibri" w:hAnsi="Calibri" w:eastAsia="Calibri"/>
+          <w:b w:val="0"/>
+          <w:color w:val="1F2937"/>
+          <w:sz w:val="22"/>
+        </w:rPr>
+        <w:t xml:space="preserve"> / </w:t>
+      </w:r>
+      <w:r>
+        <w:rPr>
+          <w:rFonts w:ascii="Calibri" w:hAnsi="Calibri" w:eastAsia="Calibri"/>
+          <w:b/>
+          <w:color w:val="1F2937"/>
+          <w:sz w:val="22"/>
+        </w:rPr>
+        <w:t>Guardar actualización</w:t>
+      </w:r>
+      <w:r>
+        <w:rPr>
+          <w:rFonts w:ascii="Calibri" w:hAnsi="Calibri" w:eastAsia="Calibri"/>
+          <w:b w:val="0"/>
+          <w:color w:val="1F2937"/>
+          <w:sz w:val="22"/>
+        </w:rPr>
+        <w:t xml:space="preserve"> no cambia de persona: se queda en la pestaña actual. El cambio de contacto es solo a mano (pestañas o flechas). Cada pestaña muestra su última </w:t>
+      </w:r>
+      <w:r>
+        <w:rPr>
+          <w:rFonts w:ascii="Calibri" w:hAnsi="Calibri" w:eastAsia="Calibri"/>
+          <w:b/>
+          <w:color w:val="1F2937"/>
+          <w:sz w:val="22"/>
+        </w:rPr>
+        <w:t>Respuesta</w:t>
+      </w:r>
+      <w:r>
+        <w:rPr>
+          <w:rFonts w:ascii="Calibri" w:hAnsi="Calibri" w:eastAsia="Calibri"/>
+          <w:b w:val="0"/>
+          <w:color w:val="1F2937"/>
+          <w:sz w:val="22"/>
+        </w:rPr>
+        <w:t xml:space="preserve">. Cambia de </w:t>
       </w:r>
       <w:r>
         <w:rPr>
@@ -1644,7 +1698,7 @@
                 <w:color w:val="1F2937"/>
                 <w:sz w:val="20"/>
               </w:rPr>
-              <w:t>Graba la respuesta en el contacto actual y se queda en la misma ficha. Si ya había un registro, el botón dice Guardar actualización.</w:t>
+              <w:t>Graba la respuesta en el contacto actual y se queda en la misma persona (misma pestaña). No cambia de contacto. Si ya había un registro, el botón dice Guardar actualización. Cada pestaña muestra su última respuesta.</w:t>
             </w:r>
           </w:p>
         </w:tc>
@@ -1671,7 +1725,7 @@
                 <w:color w:val="1F2937"/>
                 <w:sz w:val="20"/>
               </w:rPr>
-              <w:t>Cuando quiere revisar o corregir sin saltar.</w:t>
+              <w:t>Cuando quiere revisar o corregir sin saltar de persona ni de empresa.</w:t>
             </w:r>
           </w:p>
         </w:tc>
@@ -1856,6 +1910,146 @@
       <w:pPr>
         <w:spacing w:after="80"/>
       </w:pPr>
+    </w:p>
+    <w:p>
+      <w:pPr>
+        <w:spacing w:after="160" w:before="0" w:line="240" w:lineRule="auto"/>
+      </w:pPr>
+      <w:r>
+        <w:rPr>
+          <w:rFonts w:ascii="Calibri" w:hAnsi="Calibri" w:eastAsia="Calibri"/>
+          <w:b w:val="0"/>
+          <w:color w:val="1F2937"/>
+          <w:sz w:val="22"/>
+        </w:rPr>
+        <w:t xml:space="preserve">El botón verde </w:t>
+      </w:r>
+      <w:r>
+        <w:rPr>
+          <w:rFonts w:ascii="Calibri" w:hAnsi="Calibri" w:eastAsia="Calibri"/>
+          <w:b/>
+          <w:color w:val="1F2937"/>
+          <w:sz w:val="22"/>
+        </w:rPr>
+        <w:t>Guardar resultado</w:t>
+      </w:r>
+      <w:r>
+        <w:rPr>
+          <w:rFonts w:ascii="Calibri" w:hAnsi="Calibri" w:eastAsia="Calibri"/>
+          <w:b w:val="0"/>
+          <w:color w:val="1F2937"/>
+          <w:sz w:val="22"/>
+        </w:rPr>
+        <w:t xml:space="preserve"> / </w:t>
+      </w:r>
+      <w:r>
+        <w:rPr>
+          <w:rFonts w:ascii="Calibri" w:hAnsi="Calibri" w:eastAsia="Calibri"/>
+          <w:b/>
+          <w:color w:val="1F2937"/>
+          <w:sz w:val="22"/>
+        </w:rPr>
+        <w:t>Guardar actualización</w:t>
+      </w:r>
+      <w:r>
+        <w:rPr>
+          <w:rFonts w:ascii="Calibri" w:hAnsi="Calibri" w:eastAsia="Calibri"/>
+          <w:b w:val="0"/>
+          <w:color w:val="1F2937"/>
+          <w:sz w:val="22"/>
+        </w:rPr>
+        <w:t xml:space="preserve"> no cambia de persona: las pestañas (o las flechas) son el único cambio de contacto. Al abrir otra pestaña, </w:t>
+      </w:r>
+      <w:r>
+        <w:rPr>
+          <w:rFonts w:ascii="Calibri" w:hAnsi="Calibri" w:eastAsia="Calibri"/>
+          <w:b/>
+          <w:color w:val="1F2937"/>
+          <w:sz w:val="22"/>
+        </w:rPr>
+        <w:t>Respuesta</w:t>
+      </w:r>
+      <w:r>
+        <w:rPr>
+          <w:rFonts w:ascii="Calibri" w:hAnsi="Calibri" w:eastAsia="Calibri"/>
+          <w:b w:val="0"/>
+          <w:color w:val="1F2937"/>
+          <w:sz w:val="22"/>
+        </w:rPr>
+        <w:t xml:space="preserve"> y las notas son las de ese contacto (o </w:t>
+      </w:r>
+      <w:r>
+        <w:rPr>
+          <w:rFonts w:ascii="Calibri" w:hAnsi="Calibri" w:eastAsia="Calibri"/>
+          <w:b/>
+          <w:color w:val="1F2937"/>
+          <w:sz w:val="22"/>
+        </w:rPr>
+        <w:t>— Seleccionar —</w:t>
+      </w:r>
+      <w:r>
+        <w:rPr>
+          <w:rFonts w:ascii="Calibri" w:hAnsi="Calibri" w:eastAsia="Calibri"/>
+          <w:b w:val="0"/>
+          <w:color w:val="1F2937"/>
+          <w:sz w:val="22"/>
+        </w:rPr>
+        <w:t xml:space="preserve"> si aún no tiene registro suyo). </w:t>
+      </w:r>
+      <w:r>
+        <w:rPr>
+          <w:rFonts w:ascii="Calibri" w:hAnsi="Calibri" w:eastAsia="Calibri"/>
+          <w:b/>
+          <w:color w:val="1F2937"/>
+          <w:sz w:val="22"/>
+        </w:rPr>
+        <w:t>Guardar y siguiente empresa</w:t>
+      </w:r>
+      <w:r>
+        <w:rPr>
+          <w:rFonts w:ascii="Calibri" w:hAnsi="Calibri" w:eastAsia="Calibri"/>
+          <w:b w:val="0"/>
+          <w:color w:val="1F2937"/>
+          <w:sz w:val="22"/>
+        </w:rPr>
+        <w:t xml:space="preserve"> y </w:t>
+      </w:r>
+      <w:r>
+        <w:rPr>
+          <w:rFonts w:ascii="Calibri" w:hAnsi="Calibri" w:eastAsia="Calibri"/>
+          <w:b/>
+          <w:color w:val="1F2937"/>
+          <w:sz w:val="22"/>
+        </w:rPr>
+        <w:t>Guardar y siguiente pendiente</w:t>
+      </w:r>
+      <w:r>
+        <w:rPr>
+          <w:rFonts w:ascii="Calibri" w:hAnsi="Calibri" w:eastAsia="Calibri"/>
+          <w:b w:val="0"/>
+          <w:color w:val="1F2937"/>
+          <w:sz w:val="22"/>
+        </w:rPr>
+        <w:t xml:space="preserve"> sí cambian de </w:t>
+      </w:r>
+      <w:r>
+        <w:rPr>
+          <w:rFonts w:ascii="Calibri" w:hAnsi="Calibri" w:eastAsia="Calibri"/>
+          <w:b/>
+          <w:color w:val="1F2937"/>
+          <w:sz w:val="22"/>
+        </w:rPr>
+        <w:t>RUC</w:t>
+      </w:r>
+      <w:r>
+        <w:rPr>
+          <w:rFonts w:ascii="Calibri" w:hAnsi="Calibri" w:eastAsia="Calibri"/>
+          <w:b w:val="0"/>
+          <w:color w:val="1F2937"/>
+          <w:sz w:val="22"/>
+        </w:rPr>
+        <w:t>.</w:t>
+      </w:r>
     </w:p>
     <w:p>
       <w:pPr>
@@ -5569,7 +5763,90 @@
           <w:color w:val="1F2937"/>
           <w:sz w:val="22"/>
         </w:rPr>
-        <w:t>Cambie de pestaña a mano. Si guarda en el segundo, el aviso de segundo contacto le pedirá confirmar. Es correcto registrar más de un número de la misma empresa.</w:t>
+        <w:t xml:space="preserve">Cambie de pestaña a mano. Cada pestaña muestra su última respuesta; </w:t>
+      </w:r>
+      <w:r>
+        <w:rPr>
+          <w:rFonts w:ascii="Calibri" w:hAnsi="Calibri" w:eastAsia="Calibri"/>
+          <w:b/>
+          <w:color w:val="1F2937"/>
+          <w:sz w:val="22"/>
+        </w:rPr>
+        <w:t>Guardar resultado</w:t>
+      </w:r>
+      <w:r>
+        <w:rPr>
+          <w:rFonts w:ascii="Calibri" w:hAnsi="Calibri" w:eastAsia="Calibri"/>
+          <w:b w:val="0"/>
+          <w:color w:val="1F2937"/>
+          <w:sz w:val="22"/>
+        </w:rPr>
+        <w:t xml:space="preserve"> no salta a otra persona. Si guarda en el segundo, el aviso de segundo contacto le pedirá confirmar. Es correcto registrar más de un número de la misma empresa.</w:t>
+      </w:r>
+    </w:p>
+    <w:p>
+      <w:pPr>
+        <w:pStyle w:val="Heading2"/>
+        <w:spacing w:before="200" w:after="120"/>
+      </w:pPr>
+      <w:r>
+        <w:rPr>
+          <w:rFonts w:ascii="Calibri" w:hAnsi="Calibri" w:eastAsia="Calibri"/>
+          <w:b/>
+          <w:color w:val="0F4C5C"/>
+          <w:sz w:val="26"/>
+        </w:rPr>
+        <w:t>Guardé y me cambió de persona (otra pestaña). ¿Es normal?</w:t>
+      </w:r>
+    </w:p>
+    <w:p>
+      <w:pPr>
+        <w:spacing w:after="160" w:before="0" w:line="240" w:lineRule="auto"/>
+      </w:pPr>
+      <w:r>
+        <w:rPr>
+          <w:rFonts w:ascii="Calibri" w:hAnsi="Calibri" w:eastAsia="Calibri"/>
+          <w:b w:val="0"/>
+          <w:color w:val="1F2937"/>
+          <w:sz w:val="22"/>
+        </w:rPr>
+        <w:t xml:space="preserve">No. El botón verde se queda en el mismo contacto. Si ve la </w:t>
+      </w:r>
+      <w:r>
+        <w:rPr>
+          <w:rFonts w:ascii="Calibri" w:hAnsi="Calibri" w:eastAsia="Calibri"/>
+          <w:b/>
+          <w:color w:val="1F2937"/>
+          <w:sz w:val="22"/>
+        </w:rPr>
+        <w:t>Respuesta</w:t>
+      </w:r>
+      <w:r>
+        <w:rPr>
+          <w:rFonts w:ascii="Calibri" w:hAnsi="Calibri" w:eastAsia="Calibri"/>
+          <w:b w:val="0"/>
+          <w:color w:val="1F2937"/>
+          <w:sz w:val="22"/>
+        </w:rPr>
+        <w:t xml:space="preserve"> de Mario en la pestaña de otra persona, pulse esa pestaña de nuevo: debe cargar la respuesta de ese contacto (o </w:t>
+      </w:r>
+      <w:r>
+        <w:rPr>
+          <w:rFonts w:ascii="Calibri" w:hAnsi="Calibri" w:eastAsia="Calibri"/>
+          <w:b/>
+          <w:color w:val="1F2937"/>
+          <w:sz w:val="22"/>
+        </w:rPr>
+        <w:t>— Seleccionar —</w:t>
+      </w:r>
+      <w:r>
+        <w:rPr>
+          <w:rFonts w:ascii="Calibri" w:hAnsi="Calibri" w:eastAsia="Calibri"/>
+          <w:b w:val="0"/>
+          <w:color w:val="1F2937"/>
+          <w:sz w:val="22"/>
+        </w:rPr>
+        <w:t xml:space="preserve"> si no tiene registro). El cambio de persona es solo con las pestañas o las flechas.</w:t>
       </w:r>
     </w:p>
     <w:p>

</xml_diff>

<commit_message>
fix(my-leads): keep Detalle contact tabs in plantilla order after Guardar.
Co-authored-by: Cursor <cursoragent@cursor.com>
</commit_message>
<xml_diff>
--- a/docs/manual-cola-mis-clientes-supervisora.docx
+++ b/docs/manual-cola-mis-clientes-supervisora.docx
@@ -1385,7 +1385,61 @@
           <w:color w:val="1F2937"/>
           <w:sz w:val="22"/>
         </w:rPr>
-        <w:t xml:space="preserve">Si la empresa tiene tres contactos, usted decide a cuál llama. </w:t>
+        <w:t xml:space="preserve">Si la empresa tiene tres contactos, las pestañas quedan de izquierda a derecha </w:t>
+      </w:r>
+      <w:r>
+        <w:rPr>
+          <w:rFonts w:ascii="Calibri" w:hAnsi="Calibri" w:eastAsia="Calibri"/>
+          <w:b/>
+          <w:color w:val="1F2937"/>
+          <w:sz w:val="22"/>
+        </w:rPr>
+        <w:t>como en el Excel</w:t>
+      </w:r>
+      <w:r>
+        <w:rPr>
+          <w:rFonts w:ascii="Calibri" w:hAnsi="Calibri" w:eastAsia="Calibri"/>
+          <w:b w:val="0"/>
+          <w:color w:val="1F2937"/>
+          <w:sz w:val="22"/>
+        </w:rPr>
+        <w:t xml:space="preserve"> (orden de la plantilla) y no se reordenan. Usted decide a cuál llama. Al </w:t>
+      </w:r>
+      <w:r>
+        <w:rPr>
+          <w:rFonts w:ascii="Calibri" w:hAnsi="Calibri" w:eastAsia="Calibri"/>
+          <w:b/>
+          <w:color w:val="1F2937"/>
+          <w:sz w:val="22"/>
+        </w:rPr>
+        <w:t>Guardar resultado</w:t>
+      </w:r>
+      <w:r>
+        <w:rPr>
+          <w:rFonts w:ascii="Calibri" w:hAnsi="Calibri" w:eastAsia="Calibri"/>
+          <w:b w:val="0"/>
+          <w:color w:val="1F2937"/>
+          <w:sz w:val="22"/>
+        </w:rPr>
+        <w:t xml:space="preserve">, la pestaña se pone </w:t>
+      </w:r>
+      <w:r>
+        <w:rPr>
+          <w:rFonts w:ascii="Calibri" w:hAnsi="Calibri" w:eastAsia="Calibri"/>
+          <w:b/>
+          <w:color w:val="1F2937"/>
+          <w:sz w:val="22"/>
+        </w:rPr>
+        <w:t>verde en su mismo lugar</w:t>
+      </w:r>
+      <w:r>
+        <w:rPr>
+          <w:rFonts w:ascii="Calibri" w:hAnsi="Calibri" w:eastAsia="Calibri"/>
+          <w:b w:val="0"/>
+          <w:color w:val="1F2937"/>
+          <w:sz w:val="22"/>
+        </w:rPr>
+        <w:t xml:space="preserve"> (1 de 3 sigue 1 de 3). </w:t>
       </w:r>
       <w:r>
         <w:rPr>
@@ -1698,7 +1752,7 @@
                 <w:color w:val="1F2937"/>
                 <w:sz w:val="20"/>
               </w:rPr>
-              <w:t>Graba la respuesta en el contacto actual y se queda en la misma persona (misma pestaña). No cambia de contacto. Si ya había un registro, el botón dice Guardar actualización. Cada pestaña muestra su última respuesta.</w:t>
+              <w:t>Graba la respuesta en el contacto actual y se queda en la misma persona (misma pestaña, mismo 1 de 3). La pestaña se pone verde en su sitio; no pasa al final. Si ya había un registro, el botón dice Guardar actualización. Cada pestaña muestra su última respuesta.</w:t>
             </w:r>
           </w:p>
         </w:tc>
@@ -5763,7 +5817,7 @@
           <w:color w:val="1F2937"/>
           <w:sz w:val="22"/>
         </w:rPr>
-        <w:t xml:space="preserve">Cambie de pestaña a mano. Cada pestaña muestra su última respuesta; </w:t>
+        <w:t xml:space="preserve">Cambie de pestaña a mano. El orden de las pestañas es el del Excel y no cambia. Cada pestaña muestra su última respuesta; </w:t>
       </w:r>
       <w:r>
         <w:rPr>
@@ -5781,7 +5835,7 @@
           <w:color w:val="1F2937"/>
           <w:sz w:val="22"/>
         </w:rPr>
-        <w:t xml:space="preserve"> no salta a otra persona. Si guarda en el segundo, el aviso de segundo contacto le pedirá confirmar. Es correcto registrar más de un número de la misma empresa.</w:t>
+        <w:t xml:space="preserve"> no salta a otra persona ni mueve el verde al final. Si guarda en el segundo, el aviso de segundo contacto le pedirá confirmar. Es correcto registrar más de un número de la misma empresa.</w:t>
       </w:r>
     </w:p>
     <w:p>
@@ -5810,7 +5864,7 @@
           <w:color w:val="1F2937"/>
           <w:sz w:val="22"/>
         </w:rPr>
-        <w:t xml:space="preserve">No. El botón verde se queda en el mismo contacto. Si ve la </w:t>
+        <w:t xml:space="preserve">No. El botón verde se queda en el mismo contacto y en el </w:t>
       </w:r>
       <w:r>
         <w:rPr>
@@ -5819,7 +5873,7 @@
           <w:color w:val="1F2937"/>
           <w:sz w:val="22"/>
         </w:rPr>
-        <w:t>Respuesta</w:t>
+        <w:t>mismo lugar</w:t>
       </w:r>
       <w:r>
         <w:rPr>
@@ -5828,7 +5882,7 @@
           <w:color w:val="1F2937"/>
           <w:sz w:val="22"/>
         </w:rPr>
-        <w:t xml:space="preserve"> de Mario en la pestaña de otra persona, pulse esa pestaña de nuevo: debe cargar la respuesta de ese contacto (o </w:t>
+        <w:t xml:space="preserve"> (1 de 3 sigue 1 de 3). Las pestañas no se reordenan: el verde no pasa al final. Si ve la </w:t>
       </w:r>
       <w:r>
         <w:rPr>
@@ -5837,7 +5891,7 @@
           <w:color w:val="1F2937"/>
           <w:sz w:val="22"/>
         </w:rPr>
-        <w:t>— Seleccionar —</w:t>
+        <w:t>Respuesta</w:t>
       </w:r>
       <w:r>
         <w:rPr>
@@ -5846,7 +5900,72 @@
           <w:color w:val="1F2937"/>
           <w:sz w:val="22"/>
         </w:rPr>
+        <w:t xml:space="preserve"> de Mario en la pestaña de otra persona, pulse esa pestaña de nuevo: debe cargar la respuesta de ese contacto (o </w:t>
+      </w:r>
+      <w:r>
+        <w:rPr>
+          <w:rFonts w:ascii="Calibri" w:hAnsi="Calibri" w:eastAsia="Calibri"/>
+          <w:b/>
+          <w:color w:val="1F2937"/>
+          <w:sz w:val="22"/>
+        </w:rPr>
+        <w:t>— Seleccionar —</w:t>
+      </w:r>
+      <w:r>
+        <w:rPr>
+          <w:rFonts w:ascii="Calibri" w:hAnsi="Calibri" w:eastAsia="Calibri"/>
+          <w:b w:val="0"/>
+          <w:color w:val="1F2937"/>
+          <w:sz w:val="22"/>
+        </w:rPr>
         <w:t xml:space="preserve"> si no tiene registro). El cambio de persona es solo con las pestañas o las flechas.</w:t>
+      </w:r>
+    </w:p>
+    <w:p>
+      <w:pPr>
+        <w:pStyle w:val="Heading2"/>
+        <w:spacing w:before="200" w:after="120"/>
+      </w:pPr>
+      <w:r>
+        <w:rPr>
+          <w:rFonts w:ascii="Calibri" w:hAnsi="Calibri" w:eastAsia="Calibri"/>
+          <w:b/>
+          <w:color w:val="0F4C5C"/>
+          <w:sz w:val="26"/>
+        </w:rPr>
+        <w:t>Guardé y la pestaña verde se fue al final. ¿Es normal?</w:t>
+      </w:r>
+    </w:p>
+    <w:p>
+      <w:pPr>
+        <w:spacing w:after="160" w:before="0" w:line="240" w:lineRule="auto"/>
+      </w:pPr>
+      <w:r>
+        <w:rPr>
+          <w:rFonts w:ascii="Calibri" w:hAnsi="Calibri" w:eastAsia="Calibri"/>
+          <w:b w:val="0"/>
+          <w:color w:val="1F2937"/>
+          <w:sz w:val="22"/>
+        </w:rPr>
+        <w:t xml:space="preserve">No. Las pestañas quedan de izquierda a derecha como en el Excel. Al guardar, esa pestaña se pone verde </w:t>
+      </w:r>
+      <w:r>
+        <w:rPr>
+          <w:rFonts w:ascii="Calibri" w:hAnsi="Calibri" w:eastAsia="Calibri"/>
+          <w:b/>
+          <w:color w:val="1F2937"/>
+          <w:sz w:val="22"/>
+        </w:rPr>
+        <w:t>en su sitio</w:t>
+      </w:r>
+      <w:r>
+        <w:rPr>
+          <w:rFonts w:ascii="Calibri" w:hAnsi="Calibri" w:eastAsia="Calibri"/>
+          <w:b w:val="0"/>
+          <w:color w:val="1F2937"/>
+          <w:sz w:val="22"/>
+        </w:rPr>
+        <w:t>. El orden de la plantilla no cambia.</w:t>
       </w:r>
     </w:p>
     <w:p>

</xml_diff>